<commit_message>
feat(report): enhance report generation by adding average score calculation and updating report titles
</commit_message>
<xml_diff>
--- a/template/cetak form penilain tipe text.docx
+++ b/template/cetak form penilain tipe text.docx
@@ -1,6 +1,6 @@
 
 <file path=word/document.xml><?xml version="1.0" encoding="utf-8"?>
-<w:document xmlns:wpc="http://schemas.microsoft.com/office/word/2010/wordprocessingCanvas" xmlns:cx="http://schemas.microsoft.com/office/drawing/2014/chartex" xmlns:mc="http://schemas.openxmlformats.org/markup-compatibility/2006" xmlns:o="urn:schemas-microsoft-com:office:office" xmlns:r="http://schemas.openxmlformats.org/officeDocument/2006/relationships" xmlns:m="http://schemas.openxmlformats.org/officeDocument/2006/math" xmlns:v="urn:schemas-microsoft-com:vml" xmlns:wp14="http://schemas.microsoft.com/office/word/2010/wordprocessingDrawing" xmlns:wp="http://schemas.openxmlformats.org/drawingml/2006/wordprocessingDrawing" xmlns:w10="urn:schemas-microsoft-com:office:word" xmlns:w="http://schemas.openxmlformats.org/wordprocessingml/2006/main" xmlns:w14="http://schemas.microsoft.com/office/word/2010/wordml" xmlns:w15="http://schemas.microsoft.com/office/word/2012/wordml" xmlns:w16se="http://schemas.microsoft.com/office/word/2015/wordml/symex" xmlns:wpg="http://schemas.microsoft.com/office/word/2010/wordprocessingGroup" xmlns:wpi="http://schemas.microsoft.com/office/word/2010/wordprocessingInk" xmlns:wne="http://schemas.microsoft.com/office/word/2006/wordml" xmlns:wps="http://schemas.microsoft.com/office/word/2010/wordprocessingShape" mc:Ignorable="w14 w15 w16se wp14">
+<w:document xmlns:wpc="http://schemas.microsoft.com/office/word/2010/wordprocessingCanvas" xmlns:cx="http://schemas.microsoft.com/office/drawing/2014/chartex" xmlns:cx1="http://schemas.microsoft.com/office/drawing/2015/9/8/chartex" xmlns:cx2="http://schemas.microsoft.com/office/drawing/2015/10/21/chartex" xmlns:cx3="http://schemas.microsoft.com/office/drawing/2016/5/9/chartex" xmlns:cx4="http://schemas.microsoft.com/office/drawing/2016/5/10/chartex" xmlns:cx5="http://schemas.microsoft.com/office/drawing/2016/5/11/chartex" xmlns:cx6="http://schemas.microsoft.com/office/drawing/2016/5/12/chartex" xmlns:cx7="http://schemas.microsoft.com/office/drawing/2016/5/13/chartex" xmlns:cx8="http://schemas.microsoft.com/office/drawing/2016/5/14/chartex" xmlns:mc="http://schemas.openxmlformats.org/markup-compatibility/2006" xmlns:aink="http://schemas.microsoft.com/office/drawing/2016/ink" xmlns:am3d="http://schemas.microsoft.com/office/drawing/2017/model3d" xmlns:o="urn:schemas-microsoft-com:office:office" xmlns:oel="http://schemas.microsoft.com/office/2019/extlst" xmlns:r="http://schemas.openxmlformats.org/officeDocument/2006/relationships" xmlns:m="http://schemas.openxmlformats.org/officeDocument/2006/math" xmlns:v="urn:schemas-microsoft-com:vml" xmlns:wp14="http://schemas.microsoft.com/office/word/2010/wordprocessingDrawing" xmlns:wp="http://schemas.openxmlformats.org/drawingml/2006/wordprocessingDrawing" xmlns:w10="urn:schemas-microsoft-com:office:word" xmlns:w="http://schemas.openxmlformats.org/wordprocessingml/2006/main" xmlns:w14="http://schemas.microsoft.com/office/word/2010/wordml" xmlns:w15="http://schemas.microsoft.com/office/word/2012/wordml" xmlns:w16cei="http://schemas.microsoft.com/office/word/2026/wordml/cei" xmlns:w16cex="http://schemas.microsoft.com/office/word/2018/wordml/cex" xmlns:w16cid="http://schemas.microsoft.com/office/word/2016/wordml/cid" xmlns:w16="http://schemas.microsoft.com/office/word/2018/wordml" xmlns:w16du="http://schemas.microsoft.com/office/word/2023/wordml/word16du" xmlns:w16sdtdh="http://schemas.microsoft.com/office/word/2020/wordml/sdtdatahash" xmlns:w16sdtfl="http://schemas.microsoft.com/office/word/2024/wordml/sdtformatlock" xmlns:w16se="http://schemas.microsoft.com/office/word/2015/wordml/symex" xmlns:wpg="http://schemas.microsoft.com/office/word/2010/wordprocessingGroup" xmlns:wpi="http://schemas.microsoft.com/office/word/2010/wordprocessingInk" xmlns:wne="http://schemas.microsoft.com/office/word/2006/wordml" xmlns:wps="http://schemas.microsoft.com/office/word/2010/wordprocessingShape" mc:Ignorable="w14 w15 w16se w16cid w16 w16cex w16sdtdh w16sdtfl w16du wp14">
   <w:body>
     <w:p>
       <w:pPr>
@@ -52,26 +52,7 @@
           <w:sz w:val="26"/>
           <w:szCs w:val="26"/>
         </w:rPr>
-        <w:t>(</w:t>
-      </w:r>
-      <w:r>
-        <w:rPr>
-          <w:rFonts w:ascii="Cambria" w:hAnsi="Cambria"/>
-          <w:b/>
-          <w:color w:val="FF0000"/>
-          <w:sz w:val="26"/>
-          <w:szCs w:val="26"/>
-        </w:rPr>
-        <w:t>No form</w:t>
-      </w:r>
-      <w:r>
-        <w:rPr>
-          <w:rFonts w:ascii="Cambria" w:hAnsi="Cambria"/>
-          <w:b/>
-          <w:sz w:val="26"/>
-          <w:szCs w:val="26"/>
-        </w:rPr>
-        <w:t>)</w:t>
+        <w:t>(No form)</w:t>
       </w:r>
     </w:p>
     <w:p>
@@ -81,7 +62,6 @@
         <w:rPr>
           <w:rFonts w:ascii="Cambria" w:hAnsi="Cambria" w:cs="Arial"/>
           <w:b/>
-          <w:color w:val="000000"/>
           <w:sz w:val="26"/>
           <w:szCs w:val="26"/>
           <w:shd w:val="clear" w:color="auto" w:fill="F9F9F9"/>
@@ -221,7 +201,6 @@
             <w:r>
               <w:rPr>
                 <w:rFonts w:ascii="Segoe UI" w:hAnsi="Segoe UI" w:cs="Segoe UI"/>
-                <w:color w:val="FF0000"/>
               </w:rPr>
               <w:t>judul</w:t>
             </w:r>
@@ -340,29 +319,12 @@
               <w:rPr>
                 <w:rFonts w:ascii="Segoe UI" w:hAnsi="Segoe UI" w:cs="Segoe UI"/>
               </w:rPr>
-              <w:t>(</w:t>
+              <w:t xml:space="preserve">(nama </w:t>
             </w:r>
             <w:proofErr w:type="spellStart"/>
             <w:r>
               <w:rPr>
                 <w:rFonts w:ascii="Segoe UI" w:hAnsi="Segoe UI" w:cs="Segoe UI"/>
-                <w:color w:val="FF0000"/>
-              </w:rPr>
-              <w:t>nama</w:t>
-            </w:r>
-            <w:proofErr w:type="spellEnd"/>
-            <w:r>
-              <w:rPr>
-                <w:rFonts w:ascii="Segoe UI" w:hAnsi="Segoe UI" w:cs="Segoe UI"/>
-                <w:color w:val="FF0000"/>
-              </w:rPr>
-              <w:t xml:space="preserve"> </w:t>
-            </w:r>
-            <w:proofErr w:type="spellStart"/>
-            <w:r>
-              <w:rPr>
-                <w:rFonts w:ascii="Segoe UI" w:hAnsi="Segoe UI" w:cs="Segoe UI"/>
-                <w:color w:val="FF0000"/>
               </w:rPr>
               <w:t>mhs</w:t>
             </w:r>
@@ -414,30 +376,7 @@
                 <w:sz w:val="23"/>
                 <w:szCs w:val="23"/>
               </w:rPr>
-              <w:t>(</w:t>
-            </w:r>
-            <w:proofErr w:type="spellStart"/>
-            <w:r>
-              <w:rPr>
-                <w:rFonts w:ascii="Cambria" w:hAnsi="Cambria"/>
-                <w:b/>
-                <w:bCs/>
-                <w:color w:val="FF0000"/>
-                <w:sz w:val="23"/>
-                <w:szCs w:val="23"/>
-              </w:rPr>
-              <w:t>nim</w:t>
-            </w:r>
-            <w:proofErr w:type="spellEnd"/>
-            <w:r>
-              <w:rPr>
-                <w:rFonts w:ascii="Cambria" w:hAnsi="Cambria"/>
-                <w:b/>
-                <w:bCs/>
-                <w:sz w:val="23"/>
-                <w:szCs w:val="23"/>
-              </w:rPr>
-              <w:t>)</w:t>
+              <w:t>(nim)</w:t>
             </w:r>
           </w:p>
         </w:tc>
@@ -548,21 +487,19 @@
               <w:rPr>
                 <w:rFonts w:ascii="Segoe UI" w:hAnsi="Segoe UI" w:cs="Segoe UI"/>
               </w:rPr>
-              <w:t>(</w:t>
+              <w:t xml:space="preserve">(nama </w:t>
             </w:r>
             <w:proofErr w:type="spellStart"/>
             <w:r>
               <w:rPr>
                 <w:rFonts w:ascii="Segoe UI" w:hAnsi="Segoe UI" w:cs="Segoe UI"/>
-                <w:color w:val="FF0000"/>
-              </w:rPr>
-              <w:t>nama</w:t>
+              </w:rPr>
+              <w:t>ketua</w:t>
             </w:r>
             <w:proofErr w:type="spellEnd"/>
             <w:r>
               <w:rPr>
                 <w:rFonts w:ascii="Segoe UI" w:hAnsi="Segoe UI" w:cs="Segoe UI"/>
-                <w:color w:val="FF0000"/>
               </w:rPr>
               <w:t xml:space="preserve"> </w:t>
             </w:r>
@@ -570,23 +507,6 @@
             <w:r>
               <w:rPr>
                 <w:rFonts w:ascii="Segoe UI" w:hAnsi="Segoe UI" w:cs="Segoe UI"/>
-                <w:color w:val="FF0000"/>
-              </w:rPr>
-              <w:t>ketua</w:t>
-            </w:r>
-            <w:proofErr w:type="spellEnd"/>
-            <w:r>
-              <w:rPr>
-                <w:rFonts w:ascii="Segoe UI" w:hAnsi="Segoe UI" w:cs="Segoe UI"/>
-                <w:color w:val="FF0000"/>
-              </w:rPr>
-              <w:t xml:space="preserve"> </w:t>
-            </w:r>
-            <w:proofErr w:type="spellStart"/>
-            <w:r>
-              <w:rPr>
-                <w:rFonts w:ascii="Segoe UI" w:hAnsi="Segoe UI" w:cs="Segoe UI"/>
-                <w:color w:val="FF0000"/>
               </w:rPr>
               <w:t>pembimbing</w:t>
             </w:r>
@@ -733,45 +653,21 @@
               <w:rPr>
                 <w:rFonts w:ascii="Segoe UI" w:hAnsi="Segoe UI" w:cs="Segoe UI"/>
               </w:rPr>
-              <w:t>(</w:t>
+              <w:t xml:space="preserve">(nama </w:t>
             </w:r>
             <w:proofErr w:type="spellStart"/>
             <w:r>
               <w:rPr>
                 <w:rFonts w:ascii="Segoe UI" w:hAnsi="Segoe UI" w:cs="Segoe UI"/>
-                <w:color w:val="FF0000"/>
-              </w:rPr>
-              <w:t>nama</w:t>
+              </w:rPr>
+              <w:t>pembimbing</w:t>
             </w:r>
             <w:proofErr w:type="spellEnd"/>
             <w:r>
               <w:rPr>
                 <w:rFonts w:ascii="Segoe UI" w:hAnsi="Segoe UI" w:cs="Segoe UI"/>
-                <w:color w:val="FF0000"/>
-              </w:rPr>
-              <w:t xml:space="preserve"> </w:t>
-            </w:r>
-            <w:proofErr w:type="spellStart"/>
-            <w:r>
-              <w:rPr>
-                <w:rFonts w:ascii="Segoe UI" w:hAnsi="Segoe UI" w:cs="Segoe UI"/>
-                <w:color w:val="FF0000"/>
-              </w:rPr>
-              <w:t>pembimbing</w:t>
-            </w:r>
-            <w:proofErr w:type="spellEnd"/>
-            <w:r>
-              <w:rPr>
-                <w:rFonts w:ascii="Segoe UI" w:hAnsi="Segoe UI" w:cs="Segoe UI"/>
-                <w:color w:val="FF0000"/>
-              </w:rPr>
-              <w:t xml:space="preserve"> I</w:t>
-            </w:r>
-            <w:r>
-              <w:rPr>
-                <w:rFonts w:ascii="Segoe UI" w:hAnsi="Segoe UI" w:cs="Segoe UI"/>
-              </w:rPr>
-              <w:t>)</w:t>
+              </w:rPr>
+              <w:t xml:space="preserve"> I)</w:t>
             </w:r>
           </w:p>
         </w:tc>
@@ -908,7 +804,7 @@
                 <w:sz w:val="23"/>
                 <w:szCs w:val="23"/>
               </w:rPr>
-              <w:t>(</w:t>
+              <w:t xml:space="preserve">(nama </w:t>
             </w:r>
             <w:proofErr w:type="spellStart"/>
             <w:r>
@@ -916,11 +812,10 @@
                 <w:rFonts w:ascii="Cambria" w:hAnsi="Cambria"/>
                 <w:b/>
                 <w:bCs/>
-                <w:color w:val="FF0000"/>
-                <w:sz w:val="23"/>
-                <w:szCs w:val="23"/>
-              </w:rPr>
-              <w:t>nama</w:t>
+                <w:sz w:val="23"/>
+                <w:szCs w:val="23"/>
+              </w:rPr>
+              <w:t>pembimbing</w:t>
             </w:r>
             <w:proofErr w:type="spellEnd"/>
             <w:r>
@@ -928,45 +823,10 @@
                 <w:rFonts w:ascii="Cambria" w:hAnsi="Cambria"/>
                 <w:b/>
                 <w:bCs/>
-                <w:color w:val="FF0000"/>
-                <w:sz w:val="23"/>
-                <w:szCs w:val="23"/>
-              </w:rPr>
-              <w:t xml:space="preserve"> </w:t>
-            </w:r>
-            <w:proofErr w:type="spellStart"/>
-            <w:r>
-              <w:rPr>
-                <w:rFonts w:ascii="Cambria" w:hAnsi="Cambria"/>
-                <w:b/>
-                <w:bCs/>
-                <w:color w:val="FF0000"/>
-                <w:sz w:val="23"/>
-                <w:szCs w:val="23"/>
-              </w:rPr>
-              <w:t>pembimbing</w:t>
-            </w:r>
-            <w:proofErr w:type="spellEnd"/>
-            <w:r>
-              <w:rPr>
-                <w:rFonts w:ascii="Cambria" w:hAnsi="Cambria"/>
-                <w:b/>
-                <w:bCs/>
-                <w:color w:val="FF0000"/>
-                <w:sz w:val="23"/>
-                <w:szCs w:val="23"/>
-              </w:rPr>
-              <w:t xml:space="preserve"> II</w:t>
-            </w:r>
-            <w:r>
-              <w:rPr>
-                <w:rFonts w:ascii="Cambria" w:hAnsi="Cambria"/>
-                <w:b/>
-                <w:bCs/>
-                <w:sz w:val="23"/>
-                <w:szCs w:val="23"/>
-              </w:rPr>
-              <w:t>)</w:t>
+                <w:sz w:val="23"/>
+                <w:szCs w:val="23"/>
+              </w:rPr>
+              <w:t xml:space="preserve"> II)</w:t>
             </w:r>
           </w:p>
         </w:tc>
@@ -1144,28 +1004,7 @@
           <w:szCs w:val="24"/>
           <w:lang w:val="pt-BR"/>
         </w:rPr>
-        <w:t>(</w:t>
-      </w:r>
-      <w:r>
-        <w:rPr>
-          <w:rFonts w:ascii="Cambria" w:hAnsi="Cambria"/>
-          <w:b/>
-          <w:color w:val="FF0000"/>
-          <w:sz w:val="24"/>
-          <w:szCs w:val="24"/>
-          <w:lang w:val="pt-BR"/>
-        </w:rPr>
-        <w:t>Nama penilaian</w:t>
-      </w:r>
-      <w:r>
-        <w:rPr>
-          <w:rFonts w:ascii="Cambria" w:hAnsi="Cambria"/>
-          <w:b/>
-          <w:sz w:val="24"/>
-          <w:szCs w:val="24"/>
-          <w:lang w:val="pt-BR"/>
-        </w:rPr>
-        <w:t>)</w:t>
+        <w:t>(Nama penilaian)</w:t>
       </w:r>
     </w:p>
     <w:p>
@@ -1238,7 +1077,6 @@
             <w:r>
               <w:rPr>
                 <w:rFonts w:ascii="Cambria" w:hAnsi="Cambria"/>
-                <w:color w:val="FF0000"/>
               </w:rPr>
               <w:t>catatan</w:t>
             </w:r>
@@ -1392,24 +1230,13 @@
           <w:sz w:val="24"/>
           <w:szCs w:val="24"/>
         </w:rPr>
-        <w:t>(</w:t>
-      </w:r>
-      <w:r>
-        <w:rPr>
-          <w:rFonts w:ascii="Cambria" w:hAnsi="Cambria"/>
-          <w:b/>
-          <w:color w:val="FF0000"/>
-          <w:sz w:val="24"/>
-          <w:szCs w:val="24"/>
-        </w:rPr>
-        <w:t xml:space="preserve">Nama </w:t>
+        <w:t xml:space="preserve">(Nama </w:t>
       </w:r>
       <w:proofErr w:type="spellStart"/>
       <w:r>
         <w:rPr>
           <w:rFonts w:ascii="Cambria" w:hAnsi="Cambria"/>
           <w:b/>
-          <w:color w:val="FF0000"/>
           <w:sz w:val="24"/>
           <w:szCs w:val="24"/>
         </w:rPr>
@@ -1487,7 +1314,6 @@
               <w:rPr>
                 <w:rFonts w:ascii="Cambria" w:hAnsi="Cambria"/>
                 <w:b/>
-                <w:color w:val="FF0000"/>
               </w:rPr>
               <w:t>catatan</w:t>
             </w:r>
@@ -1689,7 +1515,7 @@
           <w:sz w:val="24"/>
           <w:szCs w:val="24"/>
         </w:rPr>
-        <w:t xml:space="preserve"> di </w:t>
+        <w:t xml:space="preserve"> di atas, </w:t>
       </w:r>
       <w:proofErr w:type="spellStart"/>
       <w:r>
@@ -1698,7 +1524,7 @@
           <w:sz w:val="24"/>
           <w:szCs w:val="24"/>
         </w:rPr>
-        <w:t>atas</w:t>
+        <w:t>maka</w:t>
       </w:r>
       <w:proofErr w:type="spellEnd"/>
       <w:r>
@@ -1707,7 +1533,7 @@
           <w:sz w:val="24"/>
           <w:szCs w:val="24"/>
         </w:rPr>
-        <w:t xml:space="preserve">, </w:t>
+        <w:t xml:space="preserve"> Proposal </w:t>
       </w:r>
       <w:proofErr w:type="spellStart"/>
       <w:r>
@@ -1716,7 +1542,7 @@
           <w:sz w:val="24"/>
           <w:szCs w:val="24"/>
         </w:rPr>
-        <w:t>maka</w:t>
+        <w:t>Penelitian</w:t>
       </w:r>
       <w:proofErr w:type="spellEnd"/>
       <w:r>
@@ -1725,7 +1551,7 @@
           <w:sz w:val="24"/>
           <w:szCs w:val="24"/>
         </w:rPr>
-        <w:t xml:space="preserve"> Proposal </w:t>
+        <w:t xml:space="preserve"> </w:t>
       </w:r>
       <w:proofErr w:type="spellStart"/>
       <w:r>
@@ -1734,7 +1560,7 @@
           <w:sz w:val="24"/>
           <w:szCs w:val="24"/>
         </w:rPr>
-        <w:t>Penelitian</w:t>
+        <w:t>Disertasi</w:t>
       </w:r>
       <w:proofErr w:type="spellEnd"/>
       <w:r>
@@ -1743,43 +1569,7 @@
           <w:sz w:val="24"/>
           <w:szCs w:val="24"/>
         </w:rPr>
-        <w:t xml:space="preserve"> </w:t>
-      </w:r>
-      <w:proofErr w:type="spellStart"/>
-      <w:r>
-        <w:rPr>
-          <w:rFonts w:ascii="Cambria" w:hAnsi="Cambria"/>
-          <w:sz w:val="24"/>
-          <w:szCs w:val="24"/>
-        </w:rPr>
-        <w:t>Disertasi</w:t>
-      </w:r>
-      <w:proofErr w:type="spellEnd"/>
-      <w:r>
-        <w:rPr>
-          <w:rFonts w:ascii="Cambria" w:hAnsi="Cambria"/>
-          <w:sz w:val="24"/>
-          <w:szCs w:val="24"/>
-        </w:rPr>
-        <w:t xml:space="preserve"> di </w:t>
-      </w:r>
-      <w:proofErr w:type="spellStart"/>
-      <w:r>
-        <w:rPr>
-          <w:rFonts w:ascii="Cambria" w:hAnsi="Cambria"/>
-          <w:sz w:val="24"/>
-          <w:szCs w:val="24"/>
-        </w:rPr>
-        <w:t>atas</w:t>
-      </w:r>
-      <w:proofErr w:type="spellEnd"/>
-      <w:r>
-        <w:rPr>
-          <w:rFonts w:ascii="Cambria" w:hAnsi="Cambria"/>
-          <w:sz w:val="24"/>
-          <w:szCs w:val="24"/>
-        </w:rPr>
-        <w:t xml:space="preserve"> </w:t>
+        <w:t xml:space="preserve"> di atas </w:t>
       </w:r>
       <w:proofErr w:type="spellStart"/>
       <w:r>
@@ -2060,29 +1850,7 @@
           <w:sz w:val="24"/>
           <w:szCs w:val="24"/>
         </w:rPr>
-        <w:t xml:space="preserve"> </w:t>
-      </w:r>
-      <w:proofErr w:type="spellStart"/>
-      <w:r>
-        <w:rPr>
-          <w:rFonts w:ascii="Cambria" w:hAnsi="Cambria"/>
-          <w:b/>
-          <w:bCs/>
-          <w:sz w:val="24"/>
-          <w:szCs w:val="24"/>
-        </w:rPr>
-        <w:t>harus</w:t>
-      </w:r>
-      <w:proofErr w:type="spellEnd"/>
-      <w:r>
-        <w:rPr>
-          <w:rFonts w:ascii="Cambria" w:hAnsi="Cambria"/>
-          <w:b/>
-          <w:bCs/>
-          <w:sz w:val="24"/>
-          <w:szCs w:val="24"/>
-        </w:rPr>
-        <w:t xml:space="preserve"> </w:t>
+        <w:t xml:space="preserve"> harus </w:t>
       </w:r>
       <w:proofErr w:type="spellStart"/>
       <w:r>
@@ -2199,7 +1967,7 @@
           <w:sz w:val="24"/>
           <w:szCs w:val="24"/>
         </w:rPr>
-        <w:t xml:space="preserve"> minor </w:t>
+        <w:t xml:space="preserve"> minor dan </w:t>
       </w:r>
       <w:proofErr w:type="spellStart"/>
       <w:r>
@@ -2210,7 +1978,7 @@
           <w:sz w:val="24"/>
           <w:szCs w:val="24"/>
         </w:rPr>
-        <w:t>dan</w:t>
+        <w:t>perbaikan</w:t>
       </w:r>
       <w:proofErr w:type="spellEnd"/>
       <w:r>
@@ -2221,51 +1989,7 @@
           <w:sz w:val="24"/>
           <w:szCs w:val="24"/>
         </w:rPr>
-        <w:t xml:space="preserve"> </w:t>
-      </w:r>
-      <w:proofErr w:type="spellStart"/>
-      <w:r>
-        <w:rPr>
-          <w:rFonts w:ascii="Cambria" w:hAnsi="Cambria"/>
-          <w:b/>
-          <w:bCs/>
-          <w:sz w:val="24"/>
-          <w:szCs w:val="24"/>
-        </w:rPr>
-        <w:t>perbaikan</w:t>
-      </w:r>
-      <w:proofErr w:type="spellEnd"/>
-      <w:r>
-        <w:rPr>
-          <w:rFonts w:ascii="Cambria" w:hAnsi="Cambria"/>
-          <w:b/>
-          <w:bCs/>
-          <w:sz w:val="24"/>
-          <w:szCs w:val="24"/>
-        </w:rPr>
-        <w:t xml:space="preserve"> </w:t>
-      </w:r>
-      <w:proofErr w:type="spellStart"/>
-      <w:r>
-        <w:rPr>
-          <w:rFonts w:ascii="Cambria" w:hAnsi="Cambria"/>
-          <w:b/>
-          <w:bCs/>
-          <w:sz w:val="24"/>
-          <w:szCs w:val="24"/>
-        </w:rPr>
-        <w:t>harus</w:t>
-      </w:r>
-      <w:proofErr w:type="spellEnd"/>
-      <w:r>
-        <w:rPr>
-          <w:rFonts w:ascii="Cambria" w:hAnsi="Cambria"/>
-          <w:b/>
-          <w:bCs/>
-          <w:sz w:val="24"/>
-          <w:szCs w:val="24"/>
-        </w:rPr>
-        <w:t xml:space="preserve"> </w:t>
+        <w:t xml:space="preserve"> harus </w:t>
       </w:r>
       <w:proofErr w:type="spellStart"/>
       <w:r>
@@ -2406,8 +2130,6 @@
         </w:rPr>
         <w:t>)</w:t>
       </w:r>
-      <w:bookmarkStart w:id="5" w:name="_GoBack"/>
-      <w:bookmarkEnd w:id="5"/>
     </w:p>
     <w:p>
       <w:pPr>
@@ -2425,27 +2147,15 @@
           <w:szCs w:val="24"/>
         </w:rPr>
       </w:pPr>
-      <w:proofErr w:type="spellStart"/>
-      <w:r>
-        <w:rPr>
-          <w:rFonts w:ascii="Cambria" w:hAnsi="Cambria"/>
-          <w:b/>
-          <w:bCs/>
-          <w:sz w:val="24"/>
-          <w:szCs w:val="24"/>
-        </w:rPr>
-        <w:t>Tidak</w:t>
-      </w:r>
-      <w:proofErr w:type="spellEnd"/>
-      <w:r>
-        <w:rPr>
-          <w:rFonts w:ascii="Cambria" w:hAnsi="Cambria"/>
-          <w:b/>
-          <w:bCs/>
-          <w:sz w:val="24"/>
-          <w:szCs w:val="24"/>
-        </w:rPr>
-        <w:t xml:space="preserve"> </w:t>
+      <w:r>
+        <w:rPr>
+          <w:rFonts w:ascii="Cambria" w:hAnsi="Cambria"/>
+          <w:b/>
+          <w:bCs/>
+          <w:sz w:val="24"/>
+          <w:szCs w:val="24"/>
+        </w:rPr>
+        <w:t xml:space="preserve">Tidak </w:t>
       </w:r>
       <w:proofErr w:type="spellStart"/>
       <w:r>
@@ -2469,7 +2179,7 @@
           <w:b/>
         </w:rPr>
       </w:pPr>
-      <w:bookmarkStart w:id="6" w:name="_Hlk84190254"/>
+      <w:bookmarkStart w:id="5" w:name="_Hlk84190254"/>
       <w:bookmarkEnd w:id="2"/>
       <w:bookmarkEnd w:id="4"/>
       <w:r>
@@ -2548,7 +2258,6 @@
           <w:rFonts w:ascii="Cambria" w:hAnsi="Cambria"/>
           <w:b/>
           <w:bCs/>
-          <w:color w:val="FF0000"/>
           <w:szCs w:val="24"/>
         </w:rPr>
         <w:t>tgl</w:t>
@@ -2559,7 +2268,6 @@
           <w:rFonts w:ascii="Cambria" w:hAnsi="Cambria"/>
           <w:b/>
           <w:bCs/>
-          <w:color w:val="FF0000"/>
           <w:szCs w:val="24"/>
         </w:rPr>
         <w:t xml:space="preserve"> create </w:t>
@@ -2570,7 +2278,6 @@
           <w:rFonts w:ascii="Cambria" w:hAnsi="Cambria"/>
           <w:b/>
           <w:bCs/>
-          <w:color w:val="FF0000"/>
           <w:szCs w:val="24"/>
         </w:rPr>
         <w:t>penilaian</w:t>
@@ -2607,19 +2314,19 @@
           <w:b/>
           <w:bCs/>
           <w:szCs w:val="24"/>
-        </w:rPr>
-      </w:pPr>
-      <w:proofErr w:type="spellStart"/>
-      <w:r>
-        <w:rPr>
-          <w:rFonts w:ascii="Cambria" w:hAnsi="Cambria"/>
-          <w:b/>
-          <w:bCs/>
-          <w:szCs w:val="24"/>
+          <w:lang w:val="fi-FI"/>
+        </w:rPr>
+      </w:pPr>
+      <w:r>
+        <w:rPr>
+          <w:rFonts w:ascii="Cambria" w:hAnsi="Cambria"/>
+          <w:b/>
+          <w:bCs/>
+          <w:szCs w:val="24"/>
+          <w:lang w:val="fi-FI"/>
         </w:rPr>
         <w:t>Penilai</w:t>
       </w:r>
-      <w:proofErr w:type="spellEnd"/>
     </w:p>
     <w:p>
       <w:pPr>
@@ -2634,6 +2341,7 @@
           <w:bCs/>
           <w:sz w:val="20"/>
           <w:szCs w:val="24"/>
+          <w:lang w:val="fi-FI"/>
         </w:rPr>
       </w:pPr>
     </w:p>
@@ -2650,6 +2358,7 @@
           <w:bCs/>
           <w:sz w:val="20"/>
           <w:szCs w:val="24"/>
+          <w:lang w:val="fi-FI"/>
         </w:rPr>
       </w:pPr>
     </w:p>
@@ -2666,6 +2375,7 @@
           <w:bCs/>
           <w:sz w:val="20"/>
           <w:szCs w:val="24"/>
+          <w:lang w:val="fi-FI"/>
         </w:rPr>
       </w:pPr>
     </w:p>
@@ -2682,6 +2392,7 @@
           <w:bCs/>
           <w:szCs w:val="24"/>
           <w:u w:val="single"/>
+          <w:lang w:val="fi-FI"/>
         </w:rPr>
       </w:pPr>
       <w:r>
@@ -2691,64 +2402,20 @@
           <w:bCs/>
           <w:szCs w:val="24"/>
           <w:u w:val="single"/>
-        </w:rPr>
-        <w:t>(</w:t>
-      </w:r>
-      <w:r>
-        <w:rPr>
-          <w:rFonts w:ascii="Cambria" w:hAnsi="Cambria"/>
-          <w:b/>
-          <w:bCs/>
-          <w:color w:val="FF0000"/>
+          <w:lang w:val="fi-FI"/>
+        </w:rPr>
+        <w:t>(Nama penilai)</w:t>
+      </w:r>
+      <w:r>
+        <w:rPr>
+          <w:rFonts w:ascii="Cambria" w:hAnsi="Cambria"/>
+          <w:b/>
+          <w:bCs/>
           <w:szCs w:val="24"/>
           <w:u w:val="single"/>
-        </w:rPr>
-        <w:t xml:space="preserve">Nama </w:t>
-      </w:r>
-      <w:proofErr w:type="spellStart"/>
-      <w:proofErr w:type="gramStart"/>
-      <w:r>
-        <w:rPr>
-          <w:rFonts w:ascii="Cambria" w:hAnsi="Cambria"/>
-          <w:b/>
-          <w:bCs/>
-          <w:color w:val="FF0000"/>
-          <w:szCs w:val="24"/>
-          <w:u w:val="single"/>
-        </w:rPr>
-        <w:t>penilai</w:t>
-      </w:r>
-      <w:proofErr w:type="spellEnd"/>
-      <w:r>
-        <w:rPr>
-          <w:rFonts w:ascii="Cambria" w:hAnsi="Cambria"/>
-          <w:b/>
-          <w:bCs/>
-          <w:szCs w:val="24"/>
-          <w:u w:val="single"/>
-        </w:rPr>
-        <w:t>)</w:t>
-      </w:r>
-      <w:r>
-        <w:rPr>
-          <w:rFonts w:ascii="Cambria" w:hAnsi="Cambria"/>
-          <w:b/>
-          <w:bCs/>
-          <w:szCs w:val="24"/>
-          <w:u w:val="single"/>
-        </w:rPr>
-        <w:t>_</w:t>
-      </w:r>
-      <w:proofErr w:type="gramEnd"/>
-      <w:r>
-        <w:rPr>
-          <w:rFonts w:ascii="Cambria" w:hAnsi="Cambria"/>
-          <w:b/>
-          <w:bCs/>
-          <w:szCs w:val="24"/>
-          <w:u w:val="single"/>
-        </w:rPr>
-        <w:t>_______________________________</w:t>
+          <w:lang w:val="fi-FI"/>
+        </w:rPr>
+        <w:t>________________________________</w:t>
       </w:r>
     </w:p>
     <w:p>
@@ -2763,58 +2430,30 @@
           <w:b/>
           <w:bCs/>
           <w:szCs w:val="24"/>
-        </w:rPr>
-      </w:pPr>
-      <w:r>
-        <w:rPr>
-          <w:rFonts w:ascii="Cambria" w:hAnsi="Cambria"/>
-          <w:b/>
-          <w:bCs/>
-          <w:szCs w:val="24"/>
+          <w:lang w:val="fi-FI"/>
+        </w:rPr>
+      </w:pPr>
+      <w:r>
+        <w:rPr>
+          <w:rFonts w:ascii="Cambria" w:hAnsi="Cambria"/>
+          <w:b/>
+          <w:bCs/>
+          <w:szCs w:val="24"/>
+          <w:lang w:val="fi-FI"/>
         </w:rPr>
         <w:t>NIP</w:t>
       </w:r>
       <w:bookmarkEnd w:id="0"/>
-      <w:bookmarkEnd w:id="6"/>
-      <w:r>
-        <w:rPr>
-          <w:rFonts w:ascii="Cambria" w:hAnsi="Cambria"/>
-          <w:b/>
-          <w:bCs/>
-          <w:szCs w:val="24"/>
-        </w:rPr>
-        <w:t xml:space="preserve"> (</w:t>
-      </w:r>
-      <w:r>
-        <w:rPr>
-          <w:rFonts w:ascii="Cambria" w:hAnsi="Cambria"/>
-          <w:b/>
-          <w:bCs/>
-          <w:color w:val="FF0000"/>
-          <w:szCs w:val="24"/>
-        </w:rPr>
-        <w:t xml:space="preserve">nip </w:t>
-      </w:r>
-      <w:proofErr w:type="spellStart"/>
-      <w:r>
-        <w:rPr>
-          <w:rFonts w:ascii="Cambria" w:hAnsi="Cambria"/>
-          <w:b/>
-          <w:bCs/>
-          <w:color w:val="FF0000"/>
-          <w:szCs w:val="24"/>
-        </w:rPr>
-        <w:t>penilai</w:t>
-      </w:r>
-      <w:proofErr w:type="spellEnd"/>
-      <w:r>
-        <w:rPr>
-          <w:rFonts w:ascii="Cambria" w:hAnsi="Cambria"/>
-          <w:b/>
-          <w:bCs/>
-          <w:szCs w:val="24"/>
-        </w:rPr>
-        <w:t>)</w:t>
+      <w:bookmarkEnd w:id="5"/>
+      <w:r>
+        <w:rPr>
+          <w:rFonts w:ascii="Cambria" w:hAnsi="Cambria"/>
+          <w:b/>
+          <w:bCs/>
+          <w:szCs w:val="24"/>
+          <w:lang w:val="fi-FI"/>
+        </w:rPr>
+        <w:t xml:space="preserve"> (nip penilai)</w:t>
       </w:r>
     </w:p>
     <w:sectPr>
@@ -2829,7 +2468,7 @@
 </file>
 
 <file path=word/endnotes.xml><?xml version="1.0" encoding="utf-8"?>
-<w:endnotes xmlns:wpc="http://schemas.microsoft.com/office/word/2010/wordprocessingCanvas" xmlns:cx="http://schemas.microsoft.com/office/drawing/2014/chartex" xmlns:mc="http://schemas.openxmlformats.org/markup-compatibility/2006" xmlns:o="urn:schemas-microsoft-com:office:office" xmlns:r="http://schemas.openxmlformats.org/officeDocument/2006/relationships" xmlns:m="http://schemas.openxmlformats.org/officeDocument/2006/math" xmlns:v="urn:schemas-microsoft-com:vml" xmlns:wp14="http://schemas.microsoft.com/office/word/2010/wordprocessingDrawing" xmlns:wp="http://schemas.openxmlformats.org/drawingml/2006/wordprocessingDrawing" xmlns:w10="urn:schemas-microsoft-com:office:word" xmlns:w="http://schemas.openxmlformats.org/wordprocessingml/2006/main" xmlns:w14="http://schemas.microsoft.com/office/word/2010/wordml" xmlns:w15="http://schemas.microsoft.com/office/word/2012/wordml" xmlns:w16se="http://schemas.microsoft.com/office/word/2015/wordml/symex" xmlns:wpg="http://schemas.microsoft.com/office/word/2010/wordprocessingGroup" xmlns:wpi="http://schemas.microsoft.com/office/word/2010/wordprocessingInk" xmlns:wne="http://schemas.microsoft.com/office/word/2006/wordml" xmlns:wps="http://schemas.microsoft.com/office/word/2010/wordprocessingShape" mc:Ignorable="w14 w15 w16se wp14">
+<w:endnotes xmlns:wpc="http://schemas.microsoft.com/office/word/2010/wordprocessingCanvas" xmlns:cx="http://schemas.microsoft.com/office/drawing/2014/chartex" xmlns:cx1="http://schemas.microsoft.com/office/drawing/2015/9/8/chartex" xmlns:cx2="http://schemas.microsoft.com/office/drawing/2015/10/21/chartex" xmlns:cx3="http://schemas.microsoft.com/office/drawing/2016/5/9/chartex" xmlns:cx4="http://schemas.microsoft.com/office/drawing/2016/5/10/chartex" xmlns:cx5="http://schemas.microsoft.com/office/drawing/2016/5/11/chartex" xmlns:cx6="http://schemas.microsoft.com/office/drawing/2016/5/12/chartex" xmlns:cx7="http://schemas.microsoft.com/office/drawing/2016/5/13/chartex" xmlns:cx8="http://schemas.microsoft.com/office/drawing/2016/5/14/chartex" xmlns:mc="http://schemas.openxmlformats.org/markup-compatibility/2006" xmlns:aink="http://schemas.microsoft.com/office/drawing/2016/ink" xmlns:am3d="http://schemas.microsoft.com/office/drawing/2017/model3d" xmlns:o="urn:schemas-microsoft-com:office:office" xmlns:oel="http://schemas.microsoft.com/office/2019/extlst" xmlns:r="http://schemas.openxmlformats.org/officeDocument/2006/relationships" xmlns:m="http://schemas.openxmlformats.org/officeDocument/2006/math" xmlns:v="urn:schemas-microsoft-com:vml" xmlns:wp14="http://schemas.microsoft.com/office/word/2010/wordprocessingDrawing" xmlns:wp="http://schemas.openxmlformats.org/drawingml/2006/wordprocessingDrawing" xmlns:w10="urn:schemas-microsoft-com:office:word" xmlns:w="http://schemas.openxmlformats.org/wordprocessingml/2006/main" xmlns:w14="http://schemas.microsoft.com/office/word/2010/wordml" xmlns:w15="http://schemas.microsoft.com/office/word/2012/wordml" xmlns:w16cei="http://schemas.microsoft.com/office/word/2026/wordml/cei" xmlns:w16cex="http://schemas.microsoft.com/office/word/2018/wordml/cex" xmlns:w16cid="http://schemas.microsoft.com/office/word/2016/wordml/cid" xmlns:w16="http://schemas.microsoft.com/office/word/2018/wordml" xmlns:w16du="http://schemas.microsoft.com/office/word/2023/wordml/word16du" xmlns:w16sdtdh="http://schemas.microsoft.com/office/word/2020/wordml/sdtdatahash" xmlns:w16sdtfl="http://schemas.microsoft.com/office/word/2024/wordml/sdtformatlock" xmlns:w16se="http://schemas.microsoft.com/office/word/2015/wordml/symex" xmlns:wpg="http://schemas.microsoft.com/office/word/2010/wordprocessingGroup" xmlns:wpi="http://schemas.microsoft.com/office/word/2010/wordprocessingInk" xmlns:wne="http://schemas.microsoft.com/office/word/2006/wordml" xmlns:wps="http://schemas.microsoft.com/office/word/2010/wordprocessingShape" mc:Ignorable="w14 w15 w16se w16cid w16 w16cex w16sdtdh w16sdtfl w16du wp14">
   <w:endnote w:type="separator" w:id="-1">
     <w:p>
       <w:pPr>
@@ -2854,7 +2493,7 @@
 </file>
 
 <file path=word/footnotes.xml><?xml version="1.0" encoding="utf-8"?>
-<w:footnotes xmlns:wpc="http://schemas.microsoft.com/office/word/2010/wordprocessingCanvas" xmlns:cx="http://schemas.microsoft.com/office/drawing/2014/chartex" xmlns:mc="http://schemas.openxmlformats.org/markup-compatibility/2006" xmlns:o="urn:schemas-microsoft-com:office:office" xmlns:r="http://schemas.openxmlformats.org/officeDocument/2006/relationships" xmlns:m="http://schemas.openxmlformats.org/officeDocument/2006/math" xmlns:v="urn:schemas-microsoft-com:vml" xmlns:wp14="http://schemas.microsoft.com/office/word/2010/wordprocessingDrawing" xmlns:wp="http://schemas.openxmlformats.org/drawingml/2006/wordprocessingDrawing" xmlns:w10="urn:schemas-microsoft-com:office:word" xmlns:w="http://schemas.openxmlformats.org/wordprocessingml/2006/main" xmlns:w14="http://schemas.microsoft.com/office/word/2010/wordml" xmlns:w15="http://schemas.microsoft.com/office/word/2012/wordml" xmlns:w16se="http://schemas.microsoft.com/office/word/2015/wordml/symex" xmlns:wpg="http://schemas.microsoft.com/office/word/2010/wordprocessingGroup" xmlns:wpi="http://schemas.microsoft.com/office/word/2010/wordprocessingInk" xmlns:wne="http://schemas.microsoft.com/office/word/2006/wordml" xmlns:wps="http://schemas.microsoft.com/office/word/2010/wordprocessingShape" mc:Ignorable="w14 w15 w16se wp14">
+<w:footnotes xmlns:wpc="http://schemas.microsoft.com/office/word/2010/wordprocessingCanvas" xmlns:cx="http://schemas.microsoft.com/office/drawing/2014/chartex" xmlns:cx1="http://schemas.microsoft.com/office/drawing/2015/9/8/chartex" xmlns:cx2="http://schemas.microsoft.com/office/drawing/2015/10/21/chartex" xmlns:cx3="http://schemas.microsoft.com/office/drawing/2016/5/9/chartex" xmlns:cx4="http://schemas.microsoft.com/office/drawing/2016/5/10/chartex" xmlns:cx5="http://schemas.microsoft.com/office/drawing/2016/5/11/chartex" xmlns:cx6="http://schemas.microsoft.com/office/drawing/2016/5/12/chartex" xmlns:cx7="http://schemas.microsoft.com/office/drawing/2016/5/13/chartex" xmlns:cx8="http://schemas.microsoft.com/office/drawing/2016/5/14/chartex" xmlns:mc="http://schemas.openxmlformats.org/markup-compatibility/2006" xmlns:aink="http://schemas.microsoft.com/office/drawing/2016/ink" xmlns:am3d="http://schemas.microsoft.com/office/drawing/2017/model3d" xmlns:o="urn:schemas-microsoft-com:office:office" xmlns:oel="http://schemas.microsoft.com/office/2019/extlst" xmlns:r="http://schemas.openxmlformats.org/officeDocument/2006/relationships" xmlns:m="http://schemas.openxmlformats.org/officeDocument/2006/math" xmlns:v="urn:schemas-microsoft-com:vml" xmlns:wp14="http://schemas.microsoft.com/office/word/2010/wordprocessingDrawing" xmlns:wp="http://schemas.openxmlformats.org/drawingml/2006/wordprocessingDrawing" xmlns:w10="urn:schemas-microsoft-com:office:word" xmlns:w="http://schemas.openxmlformats.org/wordprocessingml/2006/main" xmlns:w14="http://schemas.microsoft.com/office/word/2010/wordml" xmlns:w15="http://schemas.microsoft.com/office/word/2012/wordml" xmlns:w16cei="http://schemas.microsoft.com/office/word/2026/wordml/cei" xmlns:w16cex="http://schemas.microsoft.com/office/word/2018/wordml/cex" xmlns:w16cid="http://schemas.microsoft.com/office/word/2016/wordml/cid" xmlns:w16="http://schemas.microsoft.com/office/word/2018/wordml" xmlns:w16du="http://schemas.microsoft.com/office/word/2023/wordml/word16du" xmlns:w16sdtdh="http://schemas.microsoft.com/office/word/2020/wordml/sdtdatahash" xmlns:w16sdtfl="http://schemas.microsoft.com/office/word/2024/wordml/sdtformatlock" xmlns:w16se="http://schemas.microsoft.com/office/word/2015/wordml/symex" xmlns:wpg="http://schemas.microsoft.com/office/word/2010/wordprocessingGroup" xmlns:wpi="http://schemas.microsoft.com/office/word/2010/wordprocessingInk" xmlns:wne="http://schemas.microsoft.com/office/word/2006/wordml" xmlns:wps="http://schemas.microsoft.com/office/word/2010/wordprocessingShape" mc:Ignorable="w14 w15 w16se w16cid w16 w16cex w16sdtdh w16sdtfl w16du wp14">
   <w:footnote w:type="separator" w:id="-1">
     <w:p>
       <w:pPr>
@@ -2879,7 +2518,7 @@
 </file>
 
 <file path=word/header1.xml><?xml version="1.0" encoding="utf-8"?>
-<w:hdr xmlns:wpc="http://schemas.microsoft.com/office/word/2010/wordprocessingCanvas" xmlns:cx="http://schemas.microsoft.com/office/drawing/2014/chartex" xmlns:mc="http://schemas.openxmlformats.org/markup-compatibility/2006" xmlns:o="urn:schemas-microsoft-com:office:office" xmlns:r="http://schemas.openxmlformats.org/officeDocument/2006/relationships" xmlns:m="http://schemas.openxmlformats.org/officeDocument/2006/math" xmlns:v="urn:schemas-microsoft-com:vml" xmlns:wp14="http://schemas.microsoft.com/office/word/2010/wordprocessingDrawing" xmlns:wp="http://schemas.openxmlformats.org/drawingml/2006/wordprocessingDrawing" xmlns:w10="urn:schemas-microsoft-com:office:word" xmlns:w="http://schemas.openxmlformats.org/wordprocessingml/2006/main" xmlns:w14="http://schemas.microsoft.com/office/word/2010/wordml" xmlns:w15="http://schemas.microsoft.com/office/word/2012/wordml" xmlns:w16se="http://schemas.microsoft.com/office/word/2015/wordml/symex" xmlns:wpg="http://schemas.microsoft.com/office/word/2010/wordprocessingGroup" xmlns:wpi="http://schemas.microsoft.com/office/word/2010/wordprocessingInk" xmlns:wne="http://schemas.microsoft.com/office/word/2006/wordml" xmlns:wps="http://schemas.microsoft.com/office/word/2010/wordprocessingShape" mc:Ignorable="w14 w15 w16se wp14">
+<w:hdr xmlns:wpc="http://schemas.microsoft.com/office/word/2010/wordprocessingCanvas" xmlns:cx="http://schemas.microsoft.com/office/drawing/2014/chartex" xmlns:cx1="http://schemas.microsoft.com/office/drawing/2015/9/8/chartex" xmlns:cx2="http://schemas.microsoft.com/office/drawing/2015/10/21/chartex" xmlns:cx3="http://schemas.microsoft.com/office/drawing/2016/5/9/chartex" xmlns:cx4="http://schemas.microsoft.com/office/drawing/2016/5/10/chartex" xmlns:cx5="http://schemas.microsoft.com/office/drawing/2016/5/11/chartex" xmlns:cx6="http://schemas.microsoft.com/office/drawing/2016/5/12/chartex" xmlns:cx7="http://schemas.microsoft.com/office/drawing/2016/5/13/chartex" xmlns:cx8="http://schemas.microsoft.com/office/drawing/2016/5/14/chartex" xmlns:mc="http://schemas.openxmlformats.org/markup-compatibility/2006" xmlns:aink="http://schemas.microsoft.com/office/drawing/2016/ink" xmlns:am3d="http://schemas.microsoft.com/office/drawing/2017/model3d" xmlns:o="urn:schemas-microsoft-com:office:office" xmlns:oel="http://schemas.microsoft.com/office/2019/extlst" xmlns:r="http://schemas.openxmlformats.org/officeDocument/2006/relationships" xmlns:m="http://schemas.openxmlformats.org/officeDocument/2006/math" xmlns:v="urn:schemas-microsoft-com:vml" xmlns:wp14="http://schemas.microsoft.com/office/word/2010/wordprocessingDrawing" xmlns:wp="http://schemas.openxmlformats.org/drawingml/2006/wordprocessingDrawing" xmlns:w10="urn:schemas-microsoft-com:office:word" xmlns:w="http://schemas.openxmlformats.org/wordprocessingml/2006/main" xmlns:w14="http://schemas.microsoft.com/office/word/2010/wordml" xmlns:w15="http://schemas.microsoft.com/office/word/2012/wordml" xmlns:w16cei="http://schemas.microsoft.com/office/word/2026/wordml/cei" xmlns:w16cex="http://schemas.microsoft.com/office/word/2018/wordml/cex" xmlns:w16cid="http://schemas.microsoft.com/office/word/2016/wordml/cid" xmlns:w16="http://schemas.microsoft.com/office/word/2018/wordml" xmlns:w16du="http://schemas.microsoft.com/office/word/2023/wordml/word16du" xmlns:w16sdtdh="http://schemas.microsoft.com/office/word/2020/wordml/sdtdatahash" xmlns:w16sdtfl="http://schemas.microsoft.com/office/word/2024/wordml/sdtformatlock" xmlns:w16se="http://schemas.microsoft.com/office/word/2015/wordml/symex" xmlns:wpg="http://schemas.microsoft.com/office/word/2010/wordprocessingGroup" xmlns:wpi="http://schemas.microsoft.com/office/word/2010/wordprocessingInk" xmlns:wne="http://schemas.microsoft.com/office/word/2006/wordml" xmlns:wps="http://schemas.microsoft.com/office/word/2010/wordprocessingShape" mc:Ignorable="w14 w15 w16se w16cid w16 w16cex w16sdtdh w16sdtfl w16du wp14">
   <w:tbl>
     <w:tblPr>
       <w:tblpPr w:leftFromText="180" w:rightFromText="180" w:vertAnchor="page" w:horzAnchor="margin" w:tblpX="-459" w:tblpY="750"/>
@@ -3150,7 +2789,7 @@
 </file>
 
 <file path=word/numbering.xml><?xml version="1.0" encoding="utf-8"?>
-<w:numbering xmlns:wpc="http://schemas.microsoft.com/office/word/2010/wordprocessingCanvas" xmlns:cx="http://schemas.microsoft.com/office/drawing/2014/chartex" xmlns:mc="http://schemas.openxmlformats.org/markup-compatibility/2006" xmlns:o="urn:schemas-microsoft-com:office:office" xmlns:r="http://schemas.openxmlformats.org/officeDocument/2006/relationships" xmlns:m="http://schemas.openxmlformats.org/officeDocument/2006/math" xmlns:v="urn:schemas-microsoft-com:vml" xmlns:wp14="http://schemas.microsoft.com/office/word/2010/wordprocessingDrawing" xmlns:wp="http://schemas.openxmlformats.org/drawingml/2006/wordprocessingDrawing" xmlns:w10="urn:schemas-microsoft-com:office:word" xmlns:w="http://schemas.openxmlformats.org/wordprocessingml/2006/main" xmlns:w14="http://schemas.microsoft.com/office/word/2010/wordml" xmlns:w15="http://schemas.microsoft.com/office/word/2012/wordml" xmlns:w16se="http://schemas.microsoft.com/office/word/2015/wordml/symex" xmlns:wpg="http://schemas.microsoft.com/office/word/2010/wordprocessingGroup" xmlns:wpi="http://schemas.microsoft.com/office/word/2010/wordprocessingInk" xmlns:wne="http://schemas.microsoft.com/office/word/2006/wordml" xmlns:wps="http://schemas.microsoft.com/office/word/2010/wordprocessingShape" mc:Ignorable="w14 w15 w16se wp14">
+<w:numbering xmlns:wpc="http://schemas.microsoft.com/office/word/2010/wordprocessingCanvas" xmlns:cx="http://schemas.microsoft.com/office/drawing/2014/chartex" xmlns:cx1="http://schemas.microsoft.com/office/drawing/2015/9/8/chartex" xmlns:cx2="http://schemas.microsoft.com/office/drawing/2015/10/21/chartex" xmlns:cx3="http://schemas.microsoft.com/office/drawing/2016/5/9/chartex" xmlns:cx4="http://schemas.microsoft.com/office/drawing/2016/5/10/chartex" xmlns:cx5="http://schemas.microsoft.com/office/drawing/2016/5/11/chartex" xmlns:cx6="http://schemas.microsoft.com/office/drawing/2016/5/12/chartex" xmlns:cx7="http://schemas.microsoft.com/office/drawing/2016/5/13/chartex" xmlns:cx8="http://schemas.microsoft.com/office/drawing/2016/5/14/chartex" xmlns:mc="http://schemas.openxmlformats.org/markup-compatibility/2006" xmlns:aink="http://schemas.microsoft.com/office/drawing/2016/ink" xmlns:am3d="http://schemas.microsoft.com/office/drawing/2017/model3d" xmlns:o="urn:schemas-microsoft-com:office:office" xmlns:oel="http://schemas.microsoft.com/office/2019/extlst" xmlns:r="http://schemas.openxmlformats.org/officeDocument/2006/relationships" xmlns:m="http://schemas.openxmlformats.org/officeDocument/2006/math" xmlns:v="urn:schemas-microsoft-com:vml" xmlns:wp14="http://schemas.microsoft.com/office/word/2010/wordprocessingDrawing" xmlns:wp="http://schemas.openxmlformats.org/drawingml/2006/wordprocessingDrawing" xmlns:w10="urn:schemas-microsoft-com:office:word" xmlns:w="http://schemas.openxmlformats.org/wordprocessingml/2006/main" xmlns:w14="http://schemas.microsoft.com/office/word/2010/wordml" xmlns:w15="http://schemas.microsoft.com/office/word/2012/wordml" xmlns:w16cei="http://schemas.microsoft.com/office/word/2026/wordml/cei" xmlns:w16cex="http://schemas.microsoft.com/office/word/2018/wordml/cex" xmlns:w16cid="http://schemas.microsoft.com/office/word/2016/wordml/cid" xmlns:w16="http://schemas.microsoft.com/office/word/2018/wordml" xmlns:w16du="http://schemas.microsoft.com/office/word/2023/wordml/word16du" xmlns:w16sdtdh="http://schemas.microsoft.com/office/word/2020/wordml/sdtdatahash" xmlns:w16sdtfl="http://schemas.microsoft.com/office/word/2024/wordml/sdtformatlock" xmlns:w16se="http://schemas.microsoft.com/office/word/2015/wordml/symex" xmlns:wpg="http://schemas.microsoft.com/office/word/2010/wordprocessingGroup" xmlns:wpi="http://schemas.microsoft.com/office/word/2010/wordprocessingInk" xmlns:wne="http://schemas.microsoft.com/office/word/2006/wordml" xmlns:wps="http://schemas.microsoft.com/office/word/2010/wordprocessingShape" mc:Ignorable="w14 w15 w16se w16cid w16 w16cex w16sdtdh w16sdtfl w16du wp14">
   <w:abstractNum w:abstractNumId="0" w15:restartNumberingAfterBreak="0">
     <w:nsid w:val="0414343B"/>
     <w:multiLevelType w:val="hybridMultilevel"/>
@@ -3323,7 +2962,7 @@
       </w:pPr>
     </w:lvl>
   </w:abstractNum>
-  <w:num w:numId="1">
+  <w:num w:numId="1" w16cid:durableId="856113604">
     <w:abstractNumId w:val="1"/>
     <w:lvlOverride w:ilvl="0">
       <w:startOverride w:val="1"/>
@@ -3353,7 +2992,7 @@
       <w:startOverride w:val="1"/>
     </w:lvlOverride>
   </w:num>
-  <w:num w:numId="2">
+  <w:num w:numId="2" w16cid:durableId="245304401">
     <w:abstractNumId w:val="0"/>
     <w:lvlOverride w:ilvl="0">
       <w:startOverride w:val="1"/>
@@ -3387,7 +3026,7 @@
 </file>
 
 <file path=word/styles.xml><?xml version="1.0" encoding="utf-8"?>
-<w:styles xmlns:mc="http://schemas.openxmlformats.org/markup-compatibility/2006" xmlns:r="http://schemas.openxmlformats.org/officeDocument/2006/relationships" xmlns:w="http://schemas.openxmlformats.org/wordprocessingml/2006/main" xmlns:w14="http://schemas.microsoft.com/office/word/2010/wordml" xmlns:w15="http://schemas.microsoft.com/office/word/2012/wordml" xmlns:w16se="http://schemas.microsoft.com/office/word/2015/wordml/symex" mc:Ignorable="w14 w15 w16se">
+<w:styles xmlns:mc="http://schemas.openxmlformats.org/markup-compatibility/2006" xmlns:r="http://schemas.openxmlformats.org/officeDocument/2006/relationships" xmlns:w="http://schemas.openxmlformats.org/wordprocessingml/2006/main" xmlns:w14="http://schemas.microsoft.com/office/word/2010/wordml" xmlns:w15="http://schemas.microsoft.com/office/word/2012/wordml" xmlns:w16cex="http://schemas.microsoft.com/office/word/2018/wordml/cex" xmlns:w16cid="http://schemas.microsoft.com/office/word/2016/wordml/cid" xmlns:w16="http://schemas.microsoft.com/office/word/2018/wordml" xmlns:w16du="http://schemas.microsoft.com/office/word/2023/wordml/word16du" xmlns:w16sdtdh="http://schemas.microsoft.com/office/word/2020/wordml/sdtdatahash" xmlns:w16sdtfl="http://schemas.microsoft.com/office/word/2024/wordml/sdtformatlock" xmlns:w16se="http://schemas.microsoft.com/office/word/2015/wordml/symex" mc:Ignorable="w14 w15 w16se w16cid w16 w16cex w16sdtdh w16sdtfl w16du">
   <w:docDefaults>
     <w:rPrDefault>
       <w:rPr>
@@ -3403,7 +3042,7 @@
       </w:pPr>
     </w:pPrDefault>
   </w:docDefaults>
-  <w:latentStyles w:defLockedState="0" w:defUIPriority="99" w:defSemiHidden="0" w:defUnhideWhenUsed="0" w:defQFormat="0" w:count="371">
+  <w:latentStyles w:defLockedState="0" w:defUIPriority="99" w:defSemiHidden="0" w:defUnhideWhenUsed="0" w:defQFormat="0" w:count="376">
     <w:lsdException w:name="Normal" w:uiPriority="0" w:qFormat="1"/>
     <w:lsdException w:name="heading 1" w:uiPriority="9" w:qFormat="1"/>
     <w:lsdException w:name="heading 2" w:semiHidden="1" w:uiPriority="9" w:unhideWhenUsed="1" w:qFormat="1"/>
@@ -3775,6 +3414,11 @@
     <w:lsdException w:name="List Table 5 Dark Accent 6" w:uiPriority="50"/>
     <w:lsdException w:name="List Table 6 Colorful Accent 6" w:uiPriority="51"/>
     <w:lsdException w:name="List Table 7 Colorful Accent 6" w:uiPriority="52"/>
+    <w:lsdException w:name="Mention" w:semiHidden="1" w:unhideWhenUsed="1"/>
+    <w:lsdException w:name="Smart Hyperlink" w:semiHidden="1" w:unhideWhenUsed="1"/>
+    <w:lsdException w:name="Hashtag" w:semiHidden="1" w:unhideWhenUsed="1"/>
+    <w:lsdException w:name="Unresolved Mention" w:semiHidden="1" w:unhideWhenUsed="1"/>
+    <w:lsdException w:name="Smart Link" w:semiHidden="1" w:unhideWhenUsed="1"/>
   </w:latentStyles>
   <w:style w:type="paragraph" w:default="1" w:styleId="Normal">
     <w:name w:val="Normal"/>

</xml_diff>

<commit_message>
feat(reminder): add command to send email reminders for scheduled thesis defenses, including a dry-run option and email template
</commit_message>
<xml_diff>
--- a/template/cetak form penilain tipe text.docx
+++ b/template/cetak form penilain tipe text.docx
@@ -2339,7 +2339,6 @@
           <w:rFonts w:ascii="Cambria" w:hAnsi="Cambria"/>
           <w:b/>
           <w:bCs/>
-          <w:sz w:val="20"/>
           <w:szCs w:val="24"/>
           <w:lang w:val="fi-FI"/>
         </w:rPr>
@@ -2356,7 +2355,6 @@
           <w:rFonts w:ascii="Cambria" w:hAnsi="Cambria"/>
           <w:b/>
           <w:bCs/>
-          <w:sz w:val="20"/>
           <w:szCs w:val="24"/>
           <w:lang w:val="fi-FI"/>
         </w:rPr>
@@ -2373,7 +2371,22 @@
           <w:rFonts w:ascii="Cambria" w:hAnsi="Cambria"/>
           <w:b/>
           <w:bCs/>
-          <w:sz w:val="20"/>
+          <w:szCs w:val="24"/>
+          <w:lang w:val="fi-FI"/>
+        </w:rPr>
+      </w:pPr>
+    </w:p>
+    <w:p>
+      <w:pPr>
+        <w:tabs>
+          <w:tab w:val="left" w:pos="4820"/>
+        </w:tabs>
+        <w:spacing w:after="0" w:line="240" w:lineRule="auto"/>
+        <w:ind w:left="4820"/>
+        <w:rPr>
+          <w:rFonts w:ascii="Cambria" w:hAnsi="Cambria"/>
+          <w:b/>
+          <w:bCs/>
           <w:szCs w:val="24"/>
           <w:lang w:val="fi-FI"/>
         </w:rPr>

</xml_diff>